<commit_message>
Aula 07 - Views e Elasticsearch
Ajuste de texto no briefing (md, html, docx) e no slide:
- "a camada que faltava no nosso backend" passa a ser "no nosso projeto
  de desenvolvimento web"
- estático: "nenhum código roda no servidor backend" (antes só "servidor")
</commit_message>
<xml_diff>
--- a/aulas/07/[FE 2026.2 - 07] Views e Elasticsearch.docx
+++ b/aulas/07/[FE 2026.2 - 07] Views e Elasticsearch.docx
@@ -1028,7 +1028,7 @@
           <w:sz w:val="22"/>
           <w:szCs w:val="22"/>
         </w:rPr>
-        <w:t xml:space="preserve">Esta aula começa juntando as duas pontas. O HTML, o arquivo inicial de qualquer página no navegador, também pode vir dinamicamente na resposta, exatamente como o JSON vinha. Isso abre a porta para a camada que faltava no nosso backend: a View, o V do MVC. Models e Controllers já fazem parte do projeto desde o semestre passado. Com a View, o HTML passa a viajar pelo ciclo de vida HTTP completo, passando por middlewares, controladores e camada de dados, e isso permite coisas que eram impossíveis com estático, como proteger uma página inteira com sessão antes de ela sair do servidor. Para escrever views sem sofrimento, vamos apresentar o EJS.</w:t>
+        <w:t xml:space="preserve">Esta aula começa juntando as duas pontas. O HTML, o arquivo inicial de qualquer página no navegador, também pode vir dinamicamente na resposta, exatamente como o JSON vinha. Isso abre a porta para a camada que faltava no nosso projeto de desenvolvimento web: a View, o V do MVC. Models e Controllers já fazem parte do projeto desde o semestre passado. Com a View, o HTML passa a viajar pelo ciclo de vida HTTP completo, passando por middlewares, controladores e camada de dados, e isso permite coisas que eram impossíveis com estático, como proteger uma página inteira com sessão antes de ela sair do servidor. Para escrever views sem sofrimento, vamos apresentar o EJS.</w:t>
       </w:r>
     </w:p>
     <w:p>
@@ -1365,7 +1365,7 @@
           <w:sz w:val="22"/>
           <w:szCs w:val="22"/>
         </w:rPr>
-        <w:t xml:space="preserve"> nenhum código roda no servidor para entregá-lo.</w:t>
+        <w:t xml:space="preserve"> nenhum código roda no servidor backend para entregá-lo.</w:t>
       </w:r>
     </w:p>
     <w:p>

</xml_diff>